<commit_message>
Repair the citations and keep navigation in one tab
Section 4 carried five citations that ran into a second URL, caused by leftover
hyperlinks in the source document; the document is fixed and the pages rebuilt.

Links back to the portfolio no longer open a new tab.
</commit_message>
<xml_diff>
--- a/ENG4237 Syllabus.docx
+++ b/ENG4237 Syllabus.docx
@@ -1339,7 +1339,7 @@
                 <w:rFonts w:ascii="Arial Narrow" w:hAnsi="Arial Narrow"/>
                 <w:color w:val="000000"/>
               </w:rPr>
-              <w:t>Crenshaw, Kimberlé. “Mapping the Margins: Intersectionality, Identity Politics, and Violence against Women of Color.” Stanford Law Review, vol. 43, no. 6, 1991, pp. 1241–99, https://doi.org/10.2307/1229039.https://dhdebates.gc.cuny.edu/read/untitled-88c11800-9446-469b-a3be-3fdb36bfbd1e/section/f5640d43-b8eb-4d49-bc4b-eb31a16f3d06</w:t>
+              <w:t>Crenshaw, Kimberlé. “Mapping the Margins: Intersectionality, Identity Politics, and Violence against Women of Color.” Stanford Law Review, vol. 43, no. 6, 1991, pp. 1241–99, https://doi.org/10.2307/1229039.</w:t>
             </w:r>
             <w:r>
               <w:rPr>
@@ -1355,31 +1355,6 @@
                 <w:color w:val="000000"/>
               </w:rPr>
             </w:r>
-            <w:hyperlink r:id="rId12" w:history="1">
-              <w:r>
-                <w:rPr>
-                  <w:rStyle w:val="Hyperlink"/>
-                  <w:rFonts w:ascii="Arial Narrow" w:hAnsi="Arial Narrow"/>
-                </w:rPr>
-                <w:t>chicagounbound.uchicago.edu/</w:t>
-              </w:r>
-              <w:proofErr w:type="spellStart"/>
-              <w:r>
-                <w:rPr>
-                  <w:rStyle w:val="Hyperlink"/>
-                  <w:rFonts w:ascii="Arial Narrow" w:hAnsi="Arial Narrow"/>
-                </w:rPr>
-                <w:t>uclf</w:t>
-              </w:r>
-              <w:proofErr w:type="spellEnd"/>
-              <w:r>
-                <w:rPr>
-                  <w:rStyle w:val="Hyperlink"/>
-                  <w:rFonts w:ascii="Arial Narrow" w:hAnsi="Arial Narrow"/>
-                </w:rPr>
-                <w:t>/vol1989/iss1/8</w:t>
-              </w:r>
-            </w:hyperlink>
             <w:r>
               <w:rPr>
                 <w:rFonts w:ascii="Arial Narrow" w:hAnsi="Arial Narrow"/>
@@ -2027,16 +2002,6 @@
                 <w:color w:val="000000"/>
               </w:rPr>
             </w:r>
-            <w:hyperlink r:id="rId6" w:history="1"/>
-            <w:hyperlink r:id="rId7" w:history="1">
-              <w:r>
-                <w:rPr>
-                  <w:rStyle w:val="Hyperlink"/>
-                  <w:rFonts w:ascii="Arial Narrow" w:hAnsi="Arial Narrow"/>
-                </w:rPr>
-                <w:t>https://dhdebates.gc.cuny.edu/read/untitled-88c11800-9446-469b-a3be-3fdb36bfbd1e/section/f5640d43-b8eb-4d49-bc4b-eb31a16f3d06</w:t>
-              </w:r>
-            </w:hyperlink>
           </w:p>
         </w:tc>
       </w:tr>
@@ -2096,16 +2061,6 @@
                 <w:color w:val="000000"/>
               </w:rPr>
             </w:r>
-            <w:hyperlink r:id="rId6" w:history="1"/>
-            <w:hyperlink r:id="rId7" w:history="1">
-              <w:r>
-                <w:rPr>
-                  <w:rStyle w:val="Hyperlink"/>
-                  <w:rFonts w:ascii="Arial Narrow" w:hAnsi="Arial Narrow"/>
-                </w:rPr>
-                <w:t>https://dhdebates.gc.cuny.edu/read/untitled-88c11800-9446-469b-a3be-3fdb36bfbd1e/section/f5640d43-b8eb-4d49-bc4b-eb31a16f3d06</w:t>
-              </w:r>
-            </w:hyperlink>
           </w:p>
         </w:tc>
       </w:tr>
@@ -2200,16 +2155,6 @@
                 <w:color w:val="000000"/>
               </w:rPr>
             </w:r>
-            <w:hyperlink r:id="rId6" w:history="1"/>
-            <w:hyperlink r:id="rId7" w:history="1">
-              <w:r>
-                <w:rPr>
-                  <w:rStyle w:val="Hyperlink"/>
-                  <w:rFonts w:ascii="Arial Narrow" w:hAnsi="Arial Narrow"/>
-                </w:rPr>
-                <w:t>https://dhdebates.gc.cuny.edu/read/untitled-88c11800-9446-469b-a3be-3fdb36bfbd1e/section/f5640d43-b8eb-4d49-bc4b-eb31a16f3d06</w:t>
-              </w:r>
-            </w:hyperlink>
           </w:p>
         </w:tc>
       </w:tr>
@@ -2269,16 +2214,6 @@
                 <w:color w:val="000000"/>
               </w:rPr>
             </w:r>
-            <w:hyperlink r:id="rId6" w:history="1"/>
-            <w:hyperlink r:id="rId7" w:history="1">
-              <w:r>
-                <w:rPr>
-                  <w:rStyle w:val="Hyperlink"/>
-                  <w:rFonts w:ascii="Arial Narrow" w:hAnsi="Arial Narrow"/>
-                </w:rPr>
-                <w:t>https://dhdebates.gc.cuny.edu/read/untitled-88c11800-9446-469b-a3be-3fdb36bfbd1e/section/f5640d43-b8eb-4d49-bc4b-eb31a16f3d06</w:t>
-              </w:r>
-            </w:hyperlink>
           </w:p>
         </w:tc>
       </w:tr>
@@ -5200,17 +5135,6 @@
                 <w:color w:val="000000"/>
               </w:rPr>
             </w:pPr>
-            <w:hyperlink r:id="rId43" w:history="1">
-              <w:r>
-                <w:rPr>
-                  <w:rStyle w:val="Hyperlink"/>
-                  <w:rFonts w:ascii="Arial Narrow" w:hAnsi="Arial Narrow"/>
-                  <w:b/>
-                  <w:bCs/>
-                </w:rPr>
-                <w:t>ChatGPT</w:t>
-              </w:r>
-            </w:hyperlink>
             <w:r>
               <w:t>Stable Diffusion</w:t>
             </w:r>
@@ -5328,17 +5252,6 @@
                 <w:color w:val="000000"/>
               </w:rPr>
             </w:pPr>
-            <w:hyperlink r:id="rId43" w:history="1">
-              <w:r>
-                <w:rPr>
-                  <w:rStyle w:val="Hyperlink"/>
-                  <w:rFonts w:ascii="Arial Narrow" w:hAnsi="Arial Narrow"/>
-                  <w:b/>
-                  <w:bCs/>
-                </w:rPr>
-                <w:t>ChatGPT</w:t>
-              </w:r>
-            </w:hyperlink>
             <w:r>
               <w:t>DeepL</w:t>
             </w:r>

</xml_diff>